<commit_message>
Add Lab Assignment 02-TIM (Timers)
</commit_message>
<xml_diff>
--- a/Lab Assignment 02-TIM (Timers)/Lab2/SDD/SDD_GPIO_Driver.docx
+++ b/Lab Assignment 02-TIM (Timers)/Lab2/SDD/SDD_GPIO_Driver.docx
@@ -44,7 +44,10 @@
         <w:t xml:space="preserve">Version: </w:t>
       </w:r>
       <w:r>
-        <w:t>1.0</w:t>
+        <w:t>1.</w:t>
+      </w:r>
+      <w:r>
+        <w:t>2</w:t>
       </w:r>
       <w:r>
         <w:br/>
@@ -120,7 +123,19 @@
         <w:rPr>
           <w:lang w:val="en-US"/>
         </w:rPr>
-        <w:t>This document describes the software design and architecture of the GPIO driver module developed for the STM32F411RE microcontroller, as part of the Microcontrollers and Embedded Systems course at CETYS Universidad. The design is based on the requirements defined in SRS-GPIO_Driver v1.0 and provides details on data structures, enumerations, register-level algorithms, and control flow to guide implementation and testing. This SDD also serves as a reference for maintenance, testing, and future improvements of the GPIO Control System firmware.</w:t>
+        <w:t>This document describes the software design and architecture of the GPIO driver module developed for the STM32F411RE microcontroller, as part of the Microcontrollers and Embedded Systems course at CETYS Universidad. The design is based on the requirements defined in SRS-GPIO_Driver v1.</w:t>
+      </w:r>
+      <w:r>
+        <w:rPr>
+          <w:lang w:val="en-US"/>
+        </w:rPr>
+        <w:t>2</w:t>
+      </w:r>
+      <w:r>
+        <w:rPr>
+          <w:lang w:val="en-US"/>
+        </w:rPr>
+        <w:t xml:space="preserve"> and provides details on data structures, enumerations, register-level algorithms, and control flow to guide implementation and testing. This SDD also serves as a reference for maintenance, testing, and future improvements of the GPIO Control System firmware.</w:t>
       </w:r>
     </w:p>
     <w:p>
@@ -1951,28 +1966,14 @@
               <w:rPr>
                 <w:lang w:val="en-US"/>
               </w:rPr>
-              <w:t>gpio_</w:t>
-            </w:r>
-            <w:proofErr w:type="gramStart"/>
-            <w:r>
-              <w:rPr>
-                <w:lang w:val="en-US"/>
-              </w:rPr>
-              <w:t>init</w:t>
+              <w:t>gpio_init</w:t>
             </w:r>
             <w:proofErr w:type="spellEnd"/>
             <w:r>
               <w:rPr>
                 <w:lang w:val="en-US"/>
               </w:rPr>
-              <w:t>(</w:t>
-            </w:r>
-            <w:proofErr w:type="gramEnd"/>
-            <w:r>
-              <w:rPr>
-                <w:lang w:val="en-US"/>
-              </w:rPr>
-              <w:t xml:space="preserve">) shall reset all supported GPIO ports (GPIOA–GPIOE) to their hardware default state via the RCC AHB1 reset sequence (RCC-&gt;AHB1RSTR assert then </w:t>
+              <w:t xml:space="preserve">() shall reset all supported GPIO ports (GPIOA–GPIOE) to their hardware default state via the RCC AHB1 reset sequence (RCC-&gt;AHB1RSTR assert then </w:t>
             </w:r>
             <w:proofErr w:type="spellStart"/>
             <w:r>
@@ -2076,14 +2077,7 @@
               <w:rPr>
                 <w:lang w:val="en-US"/>
               </w:rPr>
-              <w:t>gpio_</w:t>
-            </w:r>
-            <w:proofErr w:type="gramStart"/>
-            <w:r>
-              <w:rPr>
-                <w:lang w:val="en-US"/>
-              </w:rPr>
-              <w:t>initPort</w:t>
+              <w:t>gpio_initPort</w:t>
             </w:r>
             <w:proofErr w:type="spellEnd"/>
             <w:r>
@@ -2092,7 +2086,6 @@
               </w:rPr>
               <w:t>(</w:t>
             </w:r>
-            <w:proofErr w:type="gramEnd"/>
             <w:r>
               <w:rPr>
                 <w:lang w:val="en-US"/>
@@ -2184,14 +2177,7 @@
               <w:rPr>
                 <w:lang w:val="en-US"/>
               </w:rPr>
-              <w:t>gpio_</w:t>
-            </w:r>
-            <w:proofErr w:type="gramStart"/>
-            <w:r>
-              <w:rPr>
-                <w:lang w:val="en-US"/>
-              </w:rPr>
-              <w:t>setPinMode</w:t>
+              <w:t>gpio_setPinMode</w:t>
             </w:r>
             <w:proofErr w:type="spellEnd"/>
             <w:r>
@@ -2200,7 +2186,6 @@
               </w:rPr>
               <w:t>(</w:t>
             </w:r>
-            <w:proofErr w:type="gramEnd"/>
             <w:r>
               <w:rPr>
                 <w:lang w:val="en-US"/>
@@ -2303,14 +2288,7 @@
               <w:rPr>
                 <w:lang w:val="en-US"/>
               </w:rPr>
-              <w:t>gpio_</w:t>
-            </w:r>
-            <w:proofErr w:type="gramStart"/>
-            <w:r>
-              <w:rPr>
-                <w:lang w:val="en-US"/>
-              </w:rPr>
-              <w:t>setPin</w:t>
+              <w:t>gpio_setPin</w:t>
             </w:r>
             <w:proofErr w:type="spellEnd"/>
             <w:r>
@@ -2319,7 +2297,6 @@
               </w:rPr>
               <w:t>(</w:t>
             </w:r>
-            <w:proofErr w:type="gramEnd"/>
             <w:r>
               <w:rPr>
                 <w:lang w:val="en-US"/>
@@ -2411,14 +2388,7 @@
               <w:rPr>
                 <w:lang w:val="en-US"/>
               </w:rPr>
-              <w:t>gpio_</w:t>
-            </w:r>
-            <w:proofErr w:type="gramStart"/>
-            <w:r>
-              <w:rPr>
-                <w:lang w:val="en-US"/>
-              </w:rPr>
-              <w:t>clearPin</w:t>
+              <w:t>gpio_clearPin</w:t>
             </w:r>
             <w:proofErr w:type="spellEnd"/>
             <w:r>
@@ -2427,7 +2397,6 @@
               </w:rPr>
               <w:t>(</w:t>
             </w:r>
-            <w:proofErr w:type="gramEnd"/>
             <w:r>
               <w:rPr>
                 <w:lang w:val="en-US"/>
@@ -2522,14 +2491,7 @@
               <w:rPr>
                 <w:lang w:val="en-US"/>
               </w:rPr>
-              <w:t>gpio_</w:t>
-            </w:r>
-            <w:proofErr w:type="gramStart"/>
-            <w:r>
-              <w:rPr>
-                <w:lang w:val="en-US"/>
-              </w:rPr>
-              <w:t>togglePin</w:t>
+              <w:t>gpio_togglePin</w:t>
             </w:r>
             <w:proofErr w:type="spellEnd"/>
             <w:r>
@@ -2538,7 +2500,6 @@
               </w:rPr>
               <w:t>(</w:t>
             </w:r>
-            <w:proofErr w:type="gramEnd"/>
             <w:r>
               <w:rPr>
                 <w:lang w:val="en-US"/>
@@ -2557,21 +2518,7 @@
               <w:rPr>
                 <w:lang w:val="en-US"/>
               </w:rPr>
-              <w:t xml:space="preserve"> the ODR bit for that </w:t>
-            </w:r>
-            <w:proofErr w:type="gramStart"/>
-            <w:r>
-              <w:rPr>
-                <w:lang w:val="en-US"/>
-              </w:rPr>
-              <w:t>pin, and</w:t>
-            </w:r>
-            <w:proofErr w:type="gramEnd"/>
-            <w:r>
-              <w:rPr>
-                <w:lang w:val="en-US"/>
-              </w:rPr>
-              <w:t xml:space="preserve"> return GPIO_ERR_INVALID_PORT or GPIO_ERR_INVALID_PIN on invalid arguments.</w:t>
+              <w:t xml:space="preserve"> the ODR bit for that pin, and return GPIO_ERR_INVALID_PORT or GPIO_ERR_INVALID_PIN on invalid arguments.</w:t>
             </w:r>
           </w:p>
         </w:tc>
@@ -2658,14 +2605,7 @@
               <w:rPr>
                 <w:lang w:val="en-US"/>
               </w:rPr>
-              <w:t>gpio_</w:t>
-            </w:r>
-            <w:proofErr w:type="gramStart"/>
-            <w:r>
-              <w:rPr>
-                <w:lang w:val="en-US"/>
-              </w:rPr>
-              <w:t>readPin</w:t>
+              <w:t>gpio_readPin</w:t>
             </w:r>
             <w:proofErr w:type="spellEnd"/>
             <w:r>
@@ -2674,7 +2614,6 @@
               </w:rPr>
               <w:t>(</w:t>
             </w:r>
-            <w:proofErr w:type="gramEnd"/>
             <w:r>
               <w:rPr>
                 <w:lang w:val="en-US"/>
@@ -2783,14 +2722,7 @@
               <w:rPr>
                 <w:lang w:val="en-US"/>
               </w:rPr>
-              <w:t>gpio_</w:t>
-            </w:r>
-            <w:proofErr w:type="gramStart"/>
-            <w:r>
-              <w:rPr>
-                <w:lang w:val="en-US"/>
-              </w:rPr>
-              <w:t>setAlternateFunction</w:t>
+              <w:t>gpio_setAlternateFunction</w:t>
             </w:r>
             <w:proofErr w:type="spellEnd"/>
             <w:r>
@@ -2799,54 +2731,11 @@
               </w:rPr>
               <w:t>(</w:t>
             </w:r>
-            <w:proofErr w:type="gramEnd"/>
-            <w:r>
-              <w:rPr>
-                <w:lang w:val="en-US"/>
-              </w:rPr>
-              <w:t xml:space="preserve">) shall write the 4-bit AF number into the correct </w:t>
-            </w:r>
-            <w:proofErr w:type="gramStart"/>
-            <w:r>
-              <w:rPr>
-                <w:lang w:val="en-US"/>
-              </w:rPr>
-              <w:t>AFR[</w:t>
-            </w:r>
-            <w:proofErr w:type="gramEnd"/>
-            <w:r>
-              <w:rPr>
-                <w:lang w:val="en-US"/>
-              </w:rPr>
-              <w:t xml:space="preserve">0] (pins 0–7) or </w:t>
-            </w:r>
-            <w:proofErr w:type="gramStart"/>
-            <w:r>
-              <w:rPr>
-                <w:lang w:val="en-US"/>
-              </w:rPr>
-              <w:t>AFR[</w:t>
-            </w:r>
-            <w:proofErr w:type="gramEnd"/>
-            <w:r>
-              <w:rPr>
-                <w:lang w:val="en-US"/>
-              </w:rPr>
-              <w:t xml:space="preserve">1] (pins 8–15) field for the specified </w:t>
-            </w:r>
-            <w:proofErr w:type="gramStart"/>
-            <w:r>
-              <w:rPr>
-                <w:lang w:val="en-US"/>
-              </w:rPr>
-              <w:t>pin, and</w:t>
-            </w:r>
-            <w:proofErr w:type="gramEnd"/>
-            <w:r>
-              <w:rPr>
-                <w:lang w:val="en-US"/>
-              </w:rPr>
-              <w:t xml:space="preserve"> set MODER to alternate function mode (0b10).</w:t>
+            <w:r>
+              <w:rPr>
+                <w:lang w:val="en-US"/>
+              </w:rPr>
+              <w:t>) shall write the 4-bit AF number into the correct AFR[0] (pins 0–7) or AFR[1] (pins 8–15) field for the specified pin, and set MODER to alternate function mode (0b10).</w:t>
             </w:r>
           </w:p>
         </w:tc>
@@ -3149,49 +3038,21 @@
               <w:rPr>
                 <w:lang w:val="en-US"/>
               </w:rPr>
-              <w:t xml:space="preserve">The driver shall meet real-time performance constraints: no dynamic memory allocation; all register operations complete in bounded </w:t>
-            </w:r>
-            <w:proofErr w:type="gramStart"/>
-            <w:r>
-              <w:rPr>
-                <w:lang w:val="en-US"/>
-              </w:rPr>
-              <w:t>O(</w:t>
-            </w:r>
-            <w:proofErr w:type="gramEnd"/>
-            <w:r>
-              <w:rPr>
-                <w:lang w:val="en-US"/>
-              </w:rPr>
-              <w:t xml:space="preserve">1) time; </w:t>
+              <w:t xml:space="preserve">The driver shall meet real-time performance constraints: no dynamic memory allocation; all register operations complete in bounded O(1) time; </w:t>
             </w:r>
             <w:proofErr w:type="spellStart"/>
             <w:r>
               <w:rPr>
                 <w:lang w:val="en-US"/>
               </w:rPr>
-              <w:t>gpio_</w:t>
-            </w:r>
-            <w:proofErr w:type="gramStart"/>
-            <w:r>
-              <w:rPr>
-                <w:lang w:val="en-US"/>
-              </w:rPr>
-              <w:t>init</w:t>
+              <w:t>gpio_init</w:t>
             </w:r>
             <w:proofErr w:type="spellEnd"/>
             <w:r>
               <w:rPr>
                 <w:lang w:val="en-US"/>
               </w:rPr>
-              <w:t>(</w:t>
-            </w:r>
-            <w:proofErr w:type="gramEnd"/>
-            <w:r>
-              <w:rPr>
-                <w:lang w:val="en-US"/>
-              </w:rPr>
-              <w:t>) is the only function with multi-step reset sequencing.</w:t>
+              <w:t>() is the only function with multi-step reset sequencing.</w:t>
             </w:r>
           </w:p>
         </w:tc>
@@ -7376,25 +7237,7 @@
           <w:iCs/>
           <w:lang w:val="en-US"/>
         </w:rPr>
-        <w:t>Fig. 21 — Sequence Diagram: gpio_</w:t>
-      </w:r>
-      <w:proofErr w:type="gramStart"/>
-      <w:r>
-        <w:rPr>
-          <w:i/>
-          <w:iCs/>
-          <w:lang w:val="en-US"/>
-        </w:rPr>
-        <w:t>setAlternateFunction(</w:t>
-      </w:r>
-      <w:proofErr w:type="gramEnd"/>
-      <w:r>
-        <w:rPr>
-          <w:i/>
-          <w:iCs/>
-          <w:lang w:val="en-US"/>
-        </w:rPr>
-        <w:t>) [FR-8]</w:t>
+        <w:t>Fig. 21 — Sequence Diagram: gpio_setAlternateFunction() [FR-8]</w:t>
       </w:r>
     </w:p>
     <w:p>
@@ -7409,77 +7252,7 @@
         <w:rPr>
           <w:lang w:val="en-US"/>
         </w:rPr>
-        <w:t>The sequence diagram for gpio_</w:t>
-      </w:r>
-      <w:proofErr w:type="gramStart"/>
-      <w:r>
-        <w:rPr>
-          <w:lang w:val="en-US"/>
-        </w:rPr>
-        <w:t>setAlternateFunction(</w:t>
-      </w:r>
-      <w:proofErr w:type="gramEnd"/>
-      <w:r>
-        <w:rPr>
-          <w:lang w:val="en-US"/>
-        </w:rPr>
-        <w:t>) shows the driver's most extensive validation chain: first prv_</w:t>
-      </w:r>
-      <w:proofErr w:type="gramStart"/>
-      <w:r>
-        <w:rPr>
-          <w:lang w:val="en-US"/>
-        </w:rPr>
-        <w:t>validate(</w:t>
-      </w:r>
-      <w:proofErr w:type="gramEnd"/>
-      <w:r>
-        <w:rPr>
-          <w:lang w:val="en-US"/>
-        </w:rPr>
-        <w:t>) checks port and pin, then an explicit guard rejects af values greater than 15, returning GPIO_ERR_INVALID_AF. With all three arguments valid, the function selects the correct AFR bank: AFR[0] for pins 0–7 and AFR[1] for pins 8–15 (using idx = pin &gt;&gt; 3). The field offset within the register is shift = (pin &amp; 7) &lt;&lt; 2, which positions the 4-bit alternate function field at its exact location. The write operation applies a clear mask (</w:t>
-      </w:r>
-      <w:proofErr w:type="gramStart"/>
-      <w:r>
-        <w:rPr>
-          <w:lang w:val="en-US"/>
-        </w:rPr>
-        <w:t>AFR[</w:t>
-      </w:r>
-      <w:proofErr w:type="gramEnd"/>
-      <w:r>
-        <w:rPr>
-          <w:lang w:val="en-US"/>
-        </w:rPr>
-        <w:t xml:space="preserve">idx] &amp;= </w:t>
-      </w:r>
-      <w:proofErr w:type="gramStart"/>
-      <w:r>
-        <w:rPr>
-          <w:lang w:val="en-US"/>
-        </w:rPr>
-        <w:t>~(</w:t>
-      </w:r>
-      <w:proofErr w:type="gramEnd"/>
-      <w:r>
-        <w:rPr>
-          <w:lang w:val="en-US"/>
-        </w:rPr>
-        <w:t>0xF &lt;&lt; shift)) followed by an OR with the af value (</w:t>
-      </w:r>
-      <w:proofErr w:type="gramStart"/>
-      <w:r>
-        <w:rPr>
-          <w:lang w:val="en-US"/>
-        </w:rPr>
-        <w:t>AFR[</w:t>
-      </w:r>
-      <w:proofErr w:type="gramEnd"/>
-      <w:r>
-        <w:rPr>
-          <w:lang w:val="en-US"/>
-        </w:rPr>
-        <w:t>idx] |= af &lt;&lt; shift), leaving the 4-bit fields of neighboring pins untouched.</w:t>
+        <w:t>The sequence diagram for gpio_setAlternateFunction() shows the driver's most extensive validation chain: first prv_validate() checks port and pin, then an explicit guard rejects af values greater than 15, returning GPIO_ERR_INVALID_AF. With all three arguments valid, the function selects the correct AFR bank: AFR[0] for pins 0–7 and AFR[1] for pins 8–15 (using idx = pin &gt;&gt; 3). The field offset within the register is shift = (pin &amp; 7) &lt;&lt; 2, which positions the 4-bit alternate function field at its exact location. The write operation applies a clear mask (AFR[idx] &amp;= ~(0xF &lt;&lt; shift)) followed by an OR with the af value (AFR[idx] |= af &lt;&lt; shift), leaving the 4-bit fields of neighboring pins untouched.</w:t>
       </w:r>
     </w:p>
     <w:p>
@@ -7559,25 +7332,7 @@
           <w:iCs/>
           <w:lang w:val="en-US"/>
         </w:rPr>
-        <w:t>Fig. 22 — Activity Diagram: gpio_</w:t>
-      </w:r>
-      <w:proofErr w:type="gramStart"/>
-      <w:r>
-        <w:rPr>
-          <w:i/>
-          <w:iCs/>
-          <w:lang w:val="en-US"/>
-        </w:rPr>
-        <w:t>setAlternateFunction(</w:t>
-      </w:r>
-      <w:proofErr w:type="gramEnd"/>
-      <w:r>
-        <w:rPr>
-          <w:i/>
-          <w:iCs/>
-          <w:lang w:val="en-US"/>
-        </w:rPr>
-        <w:t>) [FR-8]</w:t>
+        <w:t>Fig. 22 — Activity Diagram: gpio_setAlternateFunction() [FR-8]</w:t>
       </w:r>
     </w:p>
     <w:p>
@@ -10176,21 +9931,7 @@
               <w:rPr>
                 <w:lang w:val="en-US"/>
               </w:rPr>
-              <w:t>-&gt;</w:t>
-            </w:r>
-            <w:proofErr w:type="gramStart"/>
-            <w:r>
-              <w:rPr>
-                <w:lang w:val="en-US"/>
-              </w:rPr>
-              <w:t>AFR[</w:t>
-            </w:r>
-            <w:proofErr w:type="gramEnd"/>
-            <w:r>
-              <w:rPr>
-                <w:lang w:val="en-US"/>
-              </w:rPr>
-              <w:t>0]</w:t>
+              <w:t>-&gt;AFR[0]</w:t>
             </w:r>
           </w:p>
         </w:tc>
@@ -10335,21 +10076,7 @@
               <w:rPr>
                 <w:lang w:val="en-US"/>
               </w:rPr>
-              <w:t>-&gt;</w:t>
-            </w:r>
-            <w:proofErr w:type="gramStart"/>
-            <w:r>
-              <w:rPr>
-                <w:lang w:val="en-US"/>
-              </w:rPr>
-              <w:t>AFR[</w:t>
-            </w:r>
-            <w:proofErr w:type="gramEnd"/>
-            <w:r>
-              <w:rPr>
-                <w:lang w:val="en-US"/>
-              </w:rPr>
-              <w:t>1]</w:t>
+              <w:t>-&gt;AFR[1]</w:t>
             </w:r>
           </w:p>
         </w:tc>
@@ -11546,19 +11273,11 @@
             </w:tcMar>
           </w:tcPr>
           <w:p>
-            <w:proofErr w:type="gramStart"/>
-            <w:r>
-              <w:rPr>
-                <w:lang w:val="en-US"/>
-              </w:rPr>
-              <w:t>AFR[</w:t>
-            </w:r>
-            <w:proofErr w:type="gramEnd"/>
-            <w:r>
-              <w:rPr>
-                <w:lang w:val="en-US"/>
-              </w:rPr>
-              <w:t>2]</w:t>
+            <w:r>
+              <w:rPr>
+                <w:lang w:val="en-US"/>
+              </w:rPr>
+              <w:t>AFR[2]</w:t>
             </w:r>
           </w:p>
         </w:tc>

</xml_diff>